<commit_message>
Expand descriptions and explanations in report 2 and presentation
Progress report 2: split the project description into three subsections
covering the organization, the interviews and observation findings, the
proposed system and the report structure; added design rationale
(no-duplication and referential-integrity principles for the data model,
permission implications of the interfaces, uniform screen layout), richer
per-screen explanations tied to the analysis artifacts, and a lessons
section in the summary. Presentation: replaced stat cards with a plain
measures table, retitled slides in a more formal register, added an
explanatory caption to every diagram slide, and a course footer, keeping
it off slides with bottom captions to avoid collisions.

Co-Authored-By: Claude Fable 5 <noreply@anthropic.com>
Claude-Session: https://claude.ai/code/session_01QH1fisjM5swE6udW66xpfG
</commit_message>
<xml_diff>
--- a/project-documents/דוח התקדמות 2 - סא הנדסה - גרסה מתוקנת.docx
+++ b/project-documents/דוח התקדמות 2 - סא הנדסה - גרסה מתוקנת.docx
@@ -260,19 +260,57 @@
       <w:pPr>
         <w:bidi/>
         <w:spacing w:after="60"/>
+        <w:ind w:right="454"/>
         <w:jc w:val="right"/>
       </w:pPr>
       <w:r>
         <w:rPr>
           <w:rFonts w:ascii="Times New Roman" w:hAnsi="Times New Roman" w:cs="David"/>
-          <w:b/>
+          <w:b w:val="0"/>
           <w:i w:val="0"/>
-          <w:sz w:val="24"/>
+          <w:sz w:val="22"/>
           <w:rtl/>
-          <w:szCs w:val="24"/>
-          <w:bCs/>
+          <w:szCs w:val="22"/>
         </w:rPr>
-        <w:t>2. חלק 1: תרשים הגאנט כפי שהוגש בהצעת הפרויקט  ..........  עמ׳ 4</w:t>
+        <w:t>1.1 הארגון והרקע לפרויקט  ..........  עמ׳ 3</w:t>
+      </w:r>
+    </w:p>
+    <w:p>
+      <w:pPr>
+        <w:bidi/>
+        <w:spacing w:after="60"/>
+        <w:ind w:right="454"/>
+        <w:jc w:val="right"/>
+      </w:pPr>
+      <w:r>
+        <w:rPr>
+          <w:rFonts w:ascii="Times New Roman" w:hAnsi="Times New Roman" w:cs="David"/>
+          <w:b w:val="0"/>
+          <w:i w:val="0"/>
+          <w:sz w:val="22"/>
+          <w:rtl/>
+          <w:szCs w:val="22"/>
+        </w:rPr>
+        <w:t>1.2 מטרת הפרויקט והמערכת המוצעת  ..........  עמ׳ 3</w:t>
+      </w:r>
+    </w:p>
+    <w:p>
+      <w:pPr>
+        <w:bidi/>
+        <w:spacing w:after="60"/>
+        <w:ind w:right="454"/>
+        <w:jc w:val="right"/>
+      </w:pPr>
+      <w:r>
+        <w:rPr>
+          <w:rFonts w:ascii="Times New Roman" w:hAnsi="Times New Roman" w:cs="David"/>
+          <w:b w:val="0"/>
+          <w:i w:val="0"/>
+          <w:sz w:val="22"/>
+          <w:rtl/>
+          <w:szCs w:val="22"/>
+        </w:rPr>
+        <w:t>1.3 מבנה הדוח  ..........  עמ׳ 4</w:t>
       </w:r>
     </w:p>
     <w:p>
@@ -291,7 +329,26 @@
           <w:szCs w:val="24"/>
           <w:bCs/>
         </w:rPr>
-        <w:t>3. חלק 2: גאנט מעודכן, סטטוס לתאריך 30.6.2026  ..........  עמ׳ 5</w:t>
+        <w:t>2. חלק 1: תרשים הגאנט כפי שהוגש בהצעת הפרויקט  ..........  עמ׳ 5</w:t>
+      </w:r>
+    </w:p>
+    <w:p>
+      <w:pPr>
+        <w:bidi/>
+        <w:spacing w:after="60"/>
+        <w:jc w:val="right"/>
+      </w:pPr>
+      <w:r>
+        <w:rPr>
+          <w:rFonts w:ascii="Times New Roman" w:hAnsi="Times New Roman" w:cs="David"/>
+          <w:b/>
+          <w:i w:val="0"/>
+          <w:sz w:val="24"/>
+          <w:rtl/>
+          <w:szCs w:val="24"/>
+          <w:bCs/>
+        </w:rPr>
+        <w:t>3. חלק 2: גאנט מעודכן, סטטוס לתאריך 30.6.2026  ..........  עמ׳ 6</w:t>
       </w:r>
     </w:p>
     <w:p>
@@ -310,7 +367,7 @@
           <w:rtl/>
           <w:szCs w:val="22"/>
         </w:rPr>
-        <w:t>3.1 תרשים הגאנט המעודכן  ..........  עמ׳ 5</w:t>
+        <w:t>3.1 תרשים הגאנט המעודכן  ..........  עמ׳ 6</w:t>
       </w:r>
     </w:p>
     <w:p>
@@ -329,7 +386,7 @@
           <w:rtl/>
           <w:szCs w:val="22"/>
         </w:rPr>
-        <w:t>3.2 הסברי השינויים בתוכנית העבודה  ..........  עמ׳ 6</w:t>
+        <w:t>3.2 הסברי השינויים בתוכנית העבודה  ..........  עמ׳ 7</w:t>
       </w:r>
     </w:p>
     <w:p>
@@ -348,7 +405,7 @@
           <w:szCs w:val="24"/>
           <w:bCs/>
         </w:rPr>
-        <w:t>4. חלק 3: תוצרי שלב העיצוב  ..........  עמ׳ 7</w:t>
+        <w:t>4. חלק 3: תוצרי שלב העיצוב  ..........  עמ׳ 8</w:t>
       </w:r>
     </w:p>
     <w:p>
@@ -367,7 +424,7 @@
           <w:rtl/>
           <w:szCs w:val="22"/>
         </w:rPr>
-        <w:t>4.1 מבנה מפורט של טבלאות בסיס הנתונים ומפתחות הגישה  ..........  עמ׳ 7</w:t>
+        <w:t>4.1 מבנה מפורט של טבלאות בסיס הנתונים ומפתחות הגישה  ..........  עמ׳ 8</w:t>
       </w:r>
     </w:p>
     <w:p>
@@ -386,7 +443,7 @@
           <w:rtl/>
           <w:szCs w:val="22"/>
         </w:rPr>
-        <w:t>4.2 מבנה מפורט של הממשקים עם סביבות המערכת  ..........  עמ׳ 8</w:t>
+        <w:t>4.2 מבנה מפורט של הממשקים עם סביבות המערכת  ..........  עמ׳ 10</w:t>
       </w:r>
     </w:p>
     <w:p>
@@ -405,7 +462,7 @@
           <w:rtl/>
           <w:szCs w:val="22"/>
         </w:rPr>
-        <w:t>4.3 עץ תפריטים  ..........  עמ׳ 9</w:t>
+        <w:t>4.3 עץ תפריטים  ..........  עמ׳ 11</w:t>
       </w:r>
     </w:p>
     <w:p>
@@ -424,7 +481,7 @@
           <w:rtl/>
           <w:szCs w:val="22"/>
         </w:rPr>
-        <w:t>4.4 עיצוב מפורט של מסכי המערכת (קלט/פלט)  ..........  עמ׳ 10</w:t>
+        <w:t>4.4 עיצוב מפורט של מסכי המערכת (קלט/פלט)  ..........  עמ׳ 12</w:t>
       </w:r>
     </w:p>
     <w:p>
@@ -443,7 +500,7 @@
           <w:szCs w:val="24"/>
           <w:bCs/>
         </w:rPr>
-        <w:t>5. סיכום והמשך הפרויקט  ..........  עמ׳ 16</w:t>
+        <w:t>5. סיכום והמשך הפרויקט  ..........  עמ׳ 18</w:t>
       </w:r>
     </w:p>
     <w:p>
@@ -474,20 +531,23 @@
     </w:p>
     <w:p>
       <w:pPr>
+        <w:pStyle w:val="Heading2"/>
         <w:bidi/>
-        <w:spacing w:after="120" w:before="0" w:line="480" w:lineRule="auto"/>
+        <w:spacing w:before="200" w:after="120"/>
         <w:jc w:val="right"/>
       </w:pPr>
       <w:r>
         <w:rPr>
           <w:rFonts w:ascii="Times New Roman" w:hAnsi="Times New Roman" w:cs="David"/>
-          <w:b w:val="0"/>
+          <w:b/>
           <w:i w:val="0"/>
-          <w:sz w:val="24"/>
+          <w:color w:val="1F4E79"/>
+          <w:sz w:val="28"/>
           <w:rtl/>
-          <w:szCs w:val="24"/>
+          <w:szCs w:val="28"/>
+          <w:bCs/>
         </w:rPr>
-        <w:t>הפרויקט מבוצע בחברת ס.א הנדסה, חברה פרטית לשיקום, תיקון ושיפוץ מבנים שנפגעו משריפות, מנזקי מים, מפגיעות טילים ומבלאי, המעניקה מענה חירום בזמינות של 24/7. כיום מנוהלת העבודה בחברה באופן ידני, בטלפון וברישומים מפוזרים, ולכן מידע הולך לאיבוד, תיאום השיבוצים משתבש, והכנת הצעות מחיר, חשבוניות ודוחות שכר אורכת זמן רב.</w:t>
+        <w:t>1.1 הארגון והרקע לפרויקט</w:t>
       </w:r>
     </w:p>
     <w:p>
@@ -505,7 +565,7 @@
           <w:rtl/>
           <w:szCs w:val="24"/>
         </w:rPr>
-        <w:t>מטרת הפרויקט היא לנתח, לאפיין ולעצב מערכת מידע מרכזית שתנהל את כל מחזור הטיפול בבקשת לקוח: קליטת הבקשה, הצעת המחיר, שיבוץ העובדים לאתרים, מעקב הביצוע, החשבוניות והזמנות החומר, וחישוב השכר החודשי, ותספק להנהלה דוחות עדכניים. הפרויקט מבוצע לפי מודל מפל המים (SDLC): שלב האיפיון הושלם והוגש בדוח התקדמות 1 (31.5.2026), ודוח זה מציג את תוצרי שלב העיצוב שבוצע בחודש יוני 2026.</w:t>
+        <w:t>ס.א הנדסה היא חברה פרטית העוסקת בשיקום, בתיקון ובשיפוץ של מבנים שנפגעו משריפות, מהצפות ונזקי מים, מפגיעות טילים ומבלאי, וכן בעבודות שיפוץ כלליות ובפירוק אסבסט באמצעות צוות מוסמך. אופי העבודה הוא של חירום: החברה זמינה 24/7, וצוות ראשוני יוצא לאתר מיד עם קבלת דיווח על נזק כדי לפנות ולאבטח אותו. לאחר מכן מגיע שמאי, מוכנת הצעת מחיר ללקוח או לחברת הביטוח, ורק לאחר אישורה משובצים עובדים וקבלני משנה לביצוע.</w:t>
       </w:r>
     </w:p>
     <w:p>
@@ -523,7 +583,103 @@
           <w:rtl/>
           <w:szCs w:val="24"/>
         </w:rPr>
-        <w:t>בהתאם להנחיות, הדוח כולל שלושה חלקים: תרשים הגאנט כפי שהוגש בהצעת הפרויקט, גאנט מעודכן לתאריך 30.6.2026 עם הסבר מנומק לכל שינוי, וכל תוצרי שלב העיצוב: מבנה טבלאות בסיס הנתונים ומפתחות הגישה, מבנה הממשקים עם סביבות המערכת, עץ התפריטים ועיצוב מפורט של כל מסכי הקלט/פלט, בצירוף הסבר לכל תרשים ומסך.</w:t>
+        <w:t>במהלך שלב האיפיון קיימתי ראיונות עם בעל החברה ועם עובדים בתפקידי מפתח, וכן ריאיון השלמה עם רואה החשבון, וליוויתי יום עבודה מלא בתצפית. מהראיונות ומהתצפית עלתה תמונה עקבית: כל שלבי התהליך מנוהלים כיום ידנית, בטלפון, בהודעות וברישומים מפוזרים. התוצאה היא אובדן וכפילות של מידע על בקשות, שיבושים בתיאום שיבוצים ובעדכון עובדים, המתנה של יומיים עד שלושה להצעת מחיר, מעקב תשלומים חלקי, וחישוב שכר חודשי שגוזל יום עבודה שלם. בעל החברה ציין בריאיון כי כפילויות פגישות ועיכובים בעדכון קבלנים הם הבעיה שמטרידה אותו ביותר.</w:t>
+      </w:r>
+    </w:p>
+    <w:p>
+      <w:pPr>
+        <w:pStyle w:val="Heading2"/>
+        <w:bidi/>
+        <w:spacing w:before="200" w:after="120"/>
+        <w:jc w:val="right"/>
+      </w:pPr>
+      <w:r>
+        <w:rPr>
+          <w:rFonts w:ascii="Times New Roman" w:hAnsi="Times New Roman" w:cs="David"/>
+          <w:b/>
+          <w:i w:val="0"/>
+          <w:color w:val="1F4E79"/>
+          <w:sz w:val="28"/>
+          <w:rtl/>
+          <w:szCs w:val="28"/>
+          <w:bCs/>
+        </w:rPr>
+        <w:t>1.2 מטרת הפרויקט והמערכת המוצעת</w:t>
+      </w:r>
+    </w:p>
+    <w:p>
+      <w:pPr>
+        <w:bidi/>
+        <w:spacing w:after="120" w:before="0" w:line="480" w:lineRule="auto"/>
+        <w:jc w:val="right"/>
+      </w:pPr>
+      <w:r>
+        <w:rPr>
+          <w:rFonts w:ascii="Times New Roman" w:hAnsi="Times New Roman" w:cs="David"/>
+          <w:b w:val="0"/>
+          <w:i w:val="0"/>
+          <w:sz w:val="24"/>
+          <w:rtl/>
+          <w:szCs w:val="24"/>
+        </w:rPr>
+        <w:t>מטרת הפרויקט היא לנתח, לאפיין ולעצב מערכת מידע מרכזית אחת שתנהל את מחזור הטיפול המלא בבקשת לקוח: קליטת הפנייה, עיבודה והכנת הצעת מחיר, שיבוץ העובדים לאתרים, מעקב הביצוע, ניהול החשבוניות והזמנות החומר, וחישוב השכר החודשי מתוך השיבוצים שבוצעו בפועל. בנוסף תפיק המערכת דוחות שוטפים להנהלה ונתונים מרוכזים לרואה החשבון. תיחום הפרויקט, כפי שאושר בהצעה, מסתיים באב-טיפוס מעוצב של המסכים; הפיתוח והתכנות עצמם הוגדרו כפיתוח עתידי.</w:t>
+      </w:r>
+    </w:p>
+    <w:p>
+      <w:pPr>
+        <w:bidi/>
+        <w:spacing w:after="120" w:before="0" w:line="480" w:lineRule="auto"/>
+        <w:jc w:val="right"/>
+      </w:pPr>
+      <w:r>
+        <w:rPr>
+          <w:rFonts w:ascii="Times New Roman" w:hAnsi="Times New Roman" w:cs="David"/>
+          <w:b w:val="0"/>
+          <w:i w:val="0"/>
+          <w:sz w:val="24"/>
+          <w:rtl/>
+          <w:szCs w:val="24"/>
+        </w:rPr>
+        <w:t>הפרויקט מבוצע לפי מחזור חיים מלא של פיתוח מערכות מידע (SDLC) במודל מפל המים, שבו כל שלב מסתיים בתוצר מאושר לפני המעבר לשלב הבא. שלב הייזום הסתיים באישור ההצעה ב-28.4.2026; שלב האיפיון הושלם והוגש בדוח התקדמות 1 ב-31.5.2026, וכלל את תרשימי התהליכים הארגוניים, מבנה המערכת וסביבתה, תרשים DFD, תרשים ERD מפורט ורשימת מסכי הקלט/פלט; ודוח זה מסכם את שלב העיצוב שבוצע בחודש יוני 2026.</w:t>
+      </w:r>
+    </w:p>
+    <w:p>
+      <w:pPr>
+        <w:pStyle w:val="Heading2"/>
+        <w:bidi/>
+        <w:spacing w:before="200" w:after="120"/>
+        <w:jc w:val="right"/>
+      </w:pPr>
+      <w:r>
+        <w:rPr>
+          <w:rFonts w:ascii="Times New Roman" w:hAnsi="Times New Roman" w:cs="David"/>
+          <w:b/>
+          <w:i w:val="0"/>
+          <w:color w:val="1F4E79"/>
+          <w:sz w:val="28"/>
+          <w:rtl/>
+          <w:szCs w:val="28"/>
+          <w:bCs/>
+        </w:rPr>
+        <w:t>1.3 מבנה הדוח</w:t>
+      </w:r>
+    </w:p>
+    <w:p>
+      <w:pPr>
+        <w:bidi/>
+        <w:spacing w:after="120" w:before="0" w:line="480" w:lineRule="auto"/>
+        <w:jc w:val="right"/>
+      </w:pPr>
+      <w:r>
+        <w:rPr>
+          <w:rFonts w:ascii="Times New Roman" w:hAnsi="Times New Roman" w:cs="David"/>
+          <w:b w:val="0"/>
+          <w:i w:val="0"/>
+          <w:sz w:val="24"/>
+          <w:rtl/>
+          <w:szCs w:val="24"/>
+        </w:rPr>
+        <w:t>הדוח ערוך לפי מבנה ההנחיות לדוחות ההתקדמות וכולל שלושה חלקים. חלק 1 מציג את תרשים הגאנט כפי שהוגש בהצעת הפרויקט, כבסיס להשוואה. חלק 2 מציג גאנט מעודכן לתאריך 30.6.2026, שבו מסומן מה בוצע בפועל, ולצדו הסבר מנומק לכל שינוי שבוצע בתוכנית. חלק 3 מרכז את כל תוצרי שלב העיצוב הנדרשים: מבנה מפורט של טבלאות בסיס הנתונים ומפתחות הגישה, מבנה מפורט של הממשקים עם סביבות המערכת, עץ התפריטים, ועיצוב מפורט של כל מסכי הקלט/פלט. לכל תרשים, טבלה ומסך מצורף הסבר מילולי. תוצרי שלב האיפיון אינם חוזרים בדוח זה, בהתאם להערת המנחה, והם מוזכרים בהפניה בלבד.</w:t>
       </w:r>
     </w:p>
     <w:p>
@@ -573,7 +729,7 @@
           <w:rtl/>
           <w:szCs w:val="22"/>
         </w:rPr>
-        <w:t>להלן תרשים הגאנט מהצעת הפרויקט המתוקנת: 31 פעילויות בארבעה שלבים, מבחירת הארגון בסוף מרץ ועד הגשת תיק הפרויקט ב-31.8.2026, עם אבני הדרך הרשמיות של הקורס.</w:t>
+        <w:t>להלן תרשים הגאנט כפי שהוגש בהצעת הפרויקט. התוכנית כוללת 31 פעילויות בארבעה שלבים עוקבים, מבחירת הארגון בסוף מרץ ועד הגשת תיק הפרויקט ב-31.8.2026. כל פעילות הוגדרה עם תאריכי התחלה וסיום ועם תלות בפעילות הקודמת לה, והתוכנית עוגנה באבני הדרך הרשמיות של הקורס (מעוינים אדומים). בסוף כל שלב תוכנן מרווח ביטחון קצר לקראת ההגשה, שנועד לספוג עיכובים בלתי צפויים.</w:t>
       </w:r>
     </w:p>
     <w:p>
@@ -693,7 +849,7 @@
           <w:rtl/>
           <w:szCs w:val="22"/>
         </w:rPr>
-        <w:t>התרשים שלהלן מציג את מצב הפרויקט בפועל נכון ל-30.6.2026: פעילויות שהושלמו (ירוק), פעילויות מתוכננות להמשך (תכלת), וקו הסטטוס האדום. כל שלושת מועדי ההגשה עד כה נשמרו במלואם: ההצעה ב-28.4, דוח התקדמות 1 ב-31.5 ודוח התקדמות 2 ב-30.6.</w:t>
+        <w:t>התרשים שלהלן מציג את מצב הפרויקט בפועל נכון ל-30.6.2026, כפי שנרשם במעקב השבועי שערכתי מול הגאנט: פעילויות שהושלמו מסומנות בירוק, פעילויות המתוכננות להמשך בתכלת, וקו מקווקו אדום מסמן את מועד הסטטוס. עשרים ושתיים פעילויות הושלמו עד מועד זה, וכל שלושת מועדי ההגשה נשמרו: ההצעה ב-28.4, דוח התקדמות 1 ב-31.5 ודוח התקדמות 2 ב-30.6. שלושה שינויים שבוצעו בתוך שלב העיצוב מוסברים בסעיף 3.2.</w:t>
       </w:r>
     </w:p>
     <w:p>
@@ -704,7 +860,7 @@
       <w:r>
         <w:drawing>
           <wp:inline xmlns:a="http://schemas.openxmlformats.org/drawingml/2006/main" xmlns:pic="http://schemas.openxmlformats.org/drawingml/2006/picture">
-            <wp:extent cx="8280000" cy="4775711"/>
+            <wp:extent cx="7992000" cy="4609599"/>
             <wp:docPr id="2" name="Picture 2"/>
             <wp:cNvGraphicFramePr>
               <a:graphicFrameLocks noChangeAspect="1"/>
@@ -725,7 +881,7 @@
                   <pic:spPr>
                     <a:xfrm>
                       <a:off x="0" y="0"/>
-                      <a:ext cx="8280000" cy="4775711"/>
+                      <a:ext cx="7992000" cy="4609599"/>
                     </a:xfrm>
                     <a:prstGeom prst="rect"/>
                   </pic:spPr>
@@ -802,7 +958,7 @@
           <w:rtl/>
           <w:szCs w:val="24"/>
         </w:rPr>
-        <w:t>בהשוואה בין הגאנט המקורי לגאנט המעודכן בוצעו שלושה שינויים, כולם בתוך שלב העיצוב וללא פגיעה באבני הדרך:</w:t>
+        <w:t>המעקב אחר התוכנית נעשה אחת לשבוע: בסוף כל שבוע השוויתי את הביצוע בפועל מול הגאנט, וכל פער תועד יחד עם סיבתו. בהשוואה בין הגאנט המקורי לגאנט המעודכן בוצעו שלושה שינויים, כולם בתוך שלב העיצוב וללא פגיעה באבני הדרך. כנדרש בהנחיות, לכל שינוי מצורפת הנמקה:</w:t>
       </w:r>
     </w:p>
     <w:p>
@@ -972,7 +1128,7 @@
           <w:rtl/>
           <w:szCs w:val="24"/>
         </w:rPr>
-        <w:t>התוצרים שלהלן נבנו בחודש יוני 2026 ונגזרים ישירות מתוצרי האיפיון שהוגשו בדוח התקדמות 1 (תרשימי התהליכים, מבנה המערכת, ה-DFD, ה-ERD ורשימת המסכים). כל התרשימים והמסכים הוכנו בתוכנות ייעודיות: התרשימים ב-draw.io והמסכים בכלי עיצוב הממשקים Figma.</w:t>
+        <w:t>מטרת שלב העיצוב היא לתרגם את תוצרי האיפיון למפרט שניתן לפתח ממנו את המערכת בפועל: מתרשים ה-ERD נגזר מבנה הטבלאות והמפתחות, מתרשים סביבת המערכת נגזר מפרט הממשקים, ומרשימת מסכי הקלט/פלט נגזרים עץ התפריטים והעיצוב המפורט של כל מסך. סדר העבודה בחודש יוני היה בהתאם: תחילה בסיס הנתונים, אחר כך הממשקים, ולבסוף עץ התפריטים והמסכים, כך שכל תוצר נשען על קודמו. כל התרשימים הוכנו בתוכנת draw.io והמסכים עוצבו בכלי עיצוב הממשקים Figma, בהתאם לדרישת הקורס לעבודה בתוכנות ייעודיות.</w:t>
       </w:r>
     </w:p>
     <w:p>
@@ -1808,7 +1964,25 @@
           <w:rtl/>
           <w:szCs w:val="22"/>
         </w:rPr>
-        <w:t>הסבר: הקשרים בין הטבלאות משקפים את התהליך העסקי. בקשה שייכת ללקוח ומקושרת לאתר; שיבוץ מקשר עובד לאתר ולבקשה שבגינה נפתחה העבודה; חשבונית נרשמת על אתר ומקושרת ללקוח (חיוב) או לספק (הזמנת חומר); ורשומת השכר החודשית מחושבת מתוך ימי העבודה שנצברו בשיבוצים שהושלמו. מפתח השכר משולב (קוד עובד + חודש) כדי לאפשר רשומה אחת בדיוק לכל עובד בכל חודש.</w:t>
+        <w:t>הסבר: הקשרים בין הטבלאות משקפים את התהליך העסקי שתואר באיפיון. בקשה שייכת ללקוח אחד ומקושרת לאתר שבו יבוצע התיקון; שיבוץ מקשר עובד לאתר ולבקשה שבגינה נפתחה העבודה; חשבונית נרשמת על אתר ומקושרת ללקוח (כאשר מדובר בחיוב) או לספק (כאשר מדובר בהזמנת חומר); ורשומת השכר החודשית מחושבת מתוך ימי העבודה שנצברו בשיבוצים שהושלמו. מפתח השכר משולב (קוד עובד + חודש) כדי שתתקיים רשומה אחת בדיוק לכל עובד בכל חודש.</w:t>
+      </w:r>
+    </w:p>
+    <w:p>
+      <w:pPr>
+        <w:bidi/>
+        <w:spacing w:after="120" w:before="0" w:line="480" w:lineRule="auto"/>
+        <w:jc w:val="right"/>
+      </w:pPr>
+      <w:r>
+        <w:rPr>
+          <w:rFonts w:ascii="Times New Roman" w:hAnsi="Times New Roman" w:cs="David"/>
+          <w:b w:val="0"/>
+          <w:i w:val="0"/>
+          <w:sz w:val="22"/>
+          <w:rtl/>
+          <w:szCs w:val="22"/>
+        </w:rPr>
+        <w:t>בבחירת המבנה הקפדתי על שני עקרונות. הראשון הוא מניעת כפילות: כל נתון נשמר בטבלה אחת בלבד, ושאר הטבלאות מפנות אליו באמצעות מפתח זר. כך, למשל, פרטי לקוח אינם נרשמים שוב בכל בקשה, אלא נקראים מטבלת הלקוחות, וזה בדיוק המענה לבעיית הכפילויות שתוארה במצב הקיים. העיקרון השני הוא שלמות הקשרים: לא ניתן ליצור שיבוץ לעובד שאינו קיים או חשבונית לאתר שאינו רשום, מפני שהמפתחות הזרים נבדקים בעת ההזנה. שני העקרונות יחד מבטיחים שהדוחות שיופקו להנהלה יתבססו על נתונים עקביים.</w:t>
       </w:r>
     </w:p>
     <w:p>
@@ -2555,7 +2729,7 @@
           <w:rtl/>
           <w:szCs w:val="22"/>
         </w:rPr>
-        <w:t>הסבר: הממשקים מול גורמי החוץ אינם ממשקים ממוחשבים ישירים בשלב זה אלא ממשקי עבודה דרך מסכי המערכת, בהתאם לתיחום שאושר בהצעה. הממשק היחיד המפיק קובץ הוא הממשק לרואה החשבון.</w:t>
+        <w:t>הסבר: בהתאם לתיחום שאושר בהצעה, הממשקים מול גורמי החוץ אינם ממשקים ממוחשבים ישירים בשלב זה אלא ממשקי עבודה דרך מסכי המערכת: נציג החברה הוא שמזין את פרטי הלקוח, הספק או הקבלן במסך המתאים. הממשק היחיד המפיק קובץ הוא הממשק לרואה החשבון, שעבורו הוגדר ייצוא חודשי של נתוני השכר והחשבוניות לקובץ Excel, בעקבות ריאיון ההשלמה שקיימתי עמו בתחילת יוני. הגדרת הממשקים בשלב זה קובעת גם את דרישות ההרשאה: נתוני שכר וכספים ייחשפו להנהלה ולרואה החשבון בלבד.</w:t>
       </w:r>
     </w:p>
     <w:p>
@@ -2721,7 +2895,7 @@
           <w:rtl/>
           <w:szCs w:val="24"/>
         </w:rPr>
-        <w:t>ששת המסכים שזוהו ברשימת המסכים באיפיון עוצבו עיצוב מלא בכלי Figma. לכל מסך מוצגים תפקידו בתהליך, סוגו והטבלאות שהוא מזין או מציג.</w:t>
+        <w:t>ששת המסכים שזוהו ברשימת המסכים באיפיון עוצבו עיצוב מלא בכלי Figma, בפריסה אחידה: כותרת המערכת ושם המשתמש בראש המסך, נתיב ניווט המראה את מיקום המסך בעץ התפריטים, שדות הקלט או הפלט בגוף המסך, וכפתורי הפעולה בתחתיתו. האחידות נועדה לקצר את זמן הלמידה של העובדים, שרובם ללא רקע טכנולוגי, בהתאם לדרישה הלא-פונקציונלית שהוגדרה בהצעה. לכל מסך מוצגים להלן תפקידו בתהליך, סוגו (קלט/פלט), השדות המרכזיים והטבלאות שהוא מזין או מציג.</w:t>
       </w:r>
     </w:p>
     <w:p>
@@ -2820,7 +2994,7 @@
           <w:rtl/>
           <w:szCs w:val="22"/>
         </w:rPr>
-        <w:t>מסך הכניסה הראשון לתהליך. נציג השירות מזין את פרטי הלקוח, כתובת או קוד אתר, סוג הבקשה (נזק או שיבוץ), תיאור חופשי ותאריך פתיחה. שמירת המסך פותחת רשומה חדשה בטבלת הבקשות במצב "ממתין לעיבוד" ומקשרת אותה ללקוח בטבלת הלקוחות.</w:t>
+        <w:t>מסך הכניסה הראשון לתהליך, המשמש את נציג השירות בזמן קבלת הפנייה הטלפונית. הנציג מזין את פרטי הלקוח, כתובת או קוד אתר, סוג הבקשה (נזק או שיבוץ), תיאור חופשי ותאריך פתיחה. שדות החובה מסומנים, ולא ניתן לשמור בקשה ללא שם לקוח ודרך התקשרות. שמירת המסך פותחת רשומה חדשה בטבלת הבקשות במצב "ממתין לעיבוד" ומקשרת אותה ללקוח בטבלת הלקוחות; לקוח חוזר נבחר מהרשימה הקיימת ואינו מוקם מחדש, וכך נמנעת הכפילות שאפיינה את הרישום הידני.</w:t>
       </w:r>
     </w:p>
     <w:p>
@@ -2924,7 +3098,7 @@
           <w:rtl/>
           <w:szCs w:val="22"/>
         </w:rPr>
-        <w:t>מסך פנימי לנציג החברה: התאמת אתר או קבלן לבקשה, בחירת עובד פנוי ובדיקת זמינות ציוד וחומרים לפני הכנת הצעת המחיר. המסך קורא מטבלאות האתרים והעובדים ומעדכן את רשומת הבקשה.</w:t>
+        <w:t>מסך פנימי לשימוש נציג החברה בלבד, שבו מעובדת הבקשה לאחר קליטתה: התאמת אתר או קבלן, בחירת עובד פנוי מתוך רשימת העובדים, ובדיקת זמינות ציוד וחומרים לפני הכנת הצעת המחיר. שדה ההערות הפנימיות מאפשר לנציג לתעד מידע שאינו מיועד ללקוח, למשל ממצאי ביקור השמאי. המסך קורא מטבלאות האתרים והעובדים, מעדכן את רשומת הבקשה, ובסיומו מועברת הבקשה להכנת הצעת מחיר.</w:t>
       </w:r>
     </w:p>
     <w:p>
@@ -3028,7 +3202,7 @@
           <w:rtl/>
           <w:szCs w:val="22"/>
         </w:rPr>
-        <w:t>מסך פלט המציג את חישוב ההצעה: עלות חומרים, עלות עבודה וסה"כ. אישור ההצעה מעביר את הבקשה לסטטוס "בעבודה" ופותח שיבוץ חדש; דחייה סוגרת את הבקשה עם תיעוד. השדות נשמרים ברשומת הבקשה.</w:t>
+        <w:t>מסך פלט המרכז את חישוב ההצעה ללקוח: עלות החומרים, עלות העבודה והסכום הכולל, לצד סטטוס "ממתין לאישור לקוח". שני הכפתורים בתחתית המסך מייצגים את שתי התוצאות האפשריות שהוגדרו בתרשים ה-DFD: אישור ההצעה מעביר את הבקשה לסטטוס "בעבודה" ופותח שיבוץ חדש, ואילו דחייה סוגרת את הבקשה עם תיעוד הסיבה, לצורך הפקת לקחים מסחרית. כל השדות נשמרים ברשומת הבקשה, כך שניתן לשחזר כל הצעה שנשלחה.</w:t>
       </w:r>
     </w:p>
     <w:p>
@@ -3132,7 +3306,7 @@
           <w:rtl/>
           <w:szCs w:val="22"/>
         </w:rPr>
-        <w:t>לאחר אישור ההצעה משייך מנהל העבודה עובד ספציפי לאתר, עם תאריך תחילה ותאריך סיום משוער. המסך יוצר רשומה בטבלת השיבוצים, שהיא הבסיס לחישוב השכר החודשי.</w:t>
+        <w:t>לאחר אישור ההצעה משייך מנהל העבודה עובד ספציפי לאתר, עם תאריך תחילה, תאריך סיום משוער וסטטוס שיבוץ. המסך יוצר רשומה בטבלת השיבוצים, שדרך המפתחות הזרים שלה מקושרים העובד, האתר והבקשה. רשומה זו היא הבסיס לשני שימושים בהמשך: מעקב ההנהלה אחר עומס העובדים, וחישוב השכר החודשי לפי ימי העבודה בפועל. העובד מקבל הודעה על השיבוץ מיד עם השמירה, במקום סבב הטלפונים שהיה נהוג עד כה.</w:t>
       </w:r>
     </w:p>
     <w:p>
@@ -3236,7 +3410,7 @@
           <w:rtl/>
           <w:szCs w:val="22"/>
         </w:rPr>
-        <w:t>מסך פלט המסכם לעובד את ימי העבודה שנצברו מהשיבוצים שהושלמו באותו חודש, את השכר ברוטו, הניכויים והנטו לתשלום. הנתונים נקראים מטבלאות השיבוצים והשכר, וניתן להדפיס את הדוח ולשלוח אותו לעובד.</w:t>
+        <w:t>מסך פלט המסכם לעובד את החודש: מספר ימי העבודה שנצברו מהשיבוצים שהושלמו, השכר ברוטו, הניכויים והנטו לתשלום, כששלושת הסכומים המרכזיים מודגשים בראש המסך. הנתונים נקראים מטבלאות השיבוצים והשכר ואינם מוזנים ידנית, וכך מתייתר האיסוף הידני שגזל עד כה יום עבודה מלא מדי חודש. את הדוח ניתן להדפיס או לשלוח לעובד, והוא משמש גם בסיס לייצוא החודשי לרואה החשבון.</w:t>
       </w:r>
     </w:p>
     <w:p>
@@ -3340,7 +3514,7 @@
           <w:rtl/>
           <w:szCs w:val="22"/>
         </w:rPr>
-        <w:t>מסך משולב: רישום הזמנת חומר מספק (קלט) והפקת חשבונית ללקוח או לקבלן לפי אתר (פלט). כל פעולה נרשמת בטבלת החשבוניות וההזמנות עם סטטוס תשלום, ומזינה את דוחות ההנהלה.</w:t>
+        <w:t>מסך משולב המשרת את שני צדי הכספים: רישום הזמנת חומר מספק על אתר מסוים (קלט), והפקת חשבונית ללקוח או לקבלן לפי אותו אתר (פלט). כל פעולה נרשמת בטבלת החשבוניות וההזמנות עם מספר חשבונית ייחודי וסטטוס תשלום, כך שההנהלה יכולה לראות בכל רגע אילו חשבוניות טרם נפרעו. ריכוז שני הצדדים במסך אחד עלה כצורך מריאיון ההשלמה עם רואה החשבון, שביקש לקשר כל הוצאת חומר לאתר שבו נצרכה.</w:t>
       </w:r>
     </w:p>
     <w:p>
@@ -3384,7 +3558,7 @@
           <w:rtl/>
           <w:szCs w:val="24"/>
         </w:rPr>
-        <w:t>שלב העיצוב הושלם במלואו ובמועדו: שבע טבלאות בסיס הנתונים הוגדרו עם מפתחות ראשיים וזרים, שישה ממשקים חיצוניים מופו עם כיווני זרימה ואופן מימוש, עץ התפריטים נבנה לפי תפקידי המשתמשים, וששת מסכי הקלט/פלט עוצבו עיצוב מלא ב-Figma. תוצרי העיצוב עקביים עם תוצרי האיפיון מדוח התקדמות 1 ועם תיחום הפרויקט שאושר בהצעה.</w:t>
+        <w:t>שלב העיצוב הושלם במלואו ובמועדו: שבע טבלאות בסיס נתונים הוגדרו עם מפתחות ראשיים וזרים, שישה ממשקים חיצוניים מופו עם כיווני זרימה ואופן מימוש, עץ התפריטים נבנה לפי תפקידי המשתמשים, וששת מסכי הקלט/פלט עוצבו עיצוב מלא ב-Figma. תוצרי העיצוב נגזרים ישירות מתוצרי האיפיון ותואמים את תיחום הפרויקט שאושר בהצעה, כך שנשמר רצף מלא בין שלושת המסמכים שהוגשו עד כה.</w:t>
       </w:r>
     </w:p>
     <w:p>
@@ -3402,7 +3576,25 @@
           <w:rtl/>
           <w:szCs w:val="24"/>
         </w:rPr>
-        <w:t>בהתאם לגאנט המעודכן, בחודש יולי יבוצעו אימות התוצרים מול בעל החברה, תיקונים והכנת מצגת הפרויקט לקראת העלאתה ב-31.7 והצגתה באמצע אוגוסט. באוגוסט ייכתבו המסקנות וההמלצות ויורכב תיק הפרויקט המלא להגשה ב-31.8.2026.</w:t>
+        <w:t>שני לקחים עיקריים עלו מהשלב הזה. האחד, ערכם של ראיונות ההשלמה: הריאיון עם רואה החשבון, שלא תוכנן מראש, שינה את מבנה טבלת החשבוניות והוסיף את דרישת הייצוא החודשי, ומוטב היה לתכנן אותו מלכתחילה בשלב האיפיון. השני, הצגת תוצרי ביניים לבעל החברה כבר במהלך העיצוב, ולא רק בסופו, חסכה תיקונים מאוחרים: שניים מהמסכים שונו בעקבות הערותיו עוד לפני השלמת השלב.</w:t>
+      </w:r>
+    </w:p>
+    <w:p>
+      <w:pPr>
+        <w:bidi/>
+        <w:spacing w:after="120" w:before="0" w:line="480" w:lineRule="auto"/>
+        <w:jc w:val="right"/>
+      </w:pPr>
+      <w:r>
+        <w:rPr>
+          <w:rFonts w:ascii="Times New Roman" w:hAnsi="Times New Roman" w:cs="David"/>
+          <w:b w:val="0"/>
+          <w:i w:val="0"/>
+          <w:sz w:val="24"/>
+          <w:rtl/>
+          <w:szCs w:val="24"/>
+        </w:rPr>
+        <w:t>בהתאם לגאנט המעודכן, בחודש יולי יבוצעו אימות סופי של התוצרים מול בעל החברה, תיקונים והכנת מצגת הפרויקט לקראת העלאתה למודל ב-31.7 והצגתה בכיתה באמצע אוגוסט. באוגוסט ייכתבו פרקי המסקנות וההמלצות, ויורכב תיק הפרויקט המלא, הכולל את ההצעה המתוקנת, תוצרי האיפיון והעיצוב והגאנט הסופי כפי שבוצע בפועל, להגשה ב-31.8.2026.</w:t>
       </w:r>
     </w:p>
     <w:sectPr>

</xml_diff>